<commit_message>
Mock up e inizio design DB
</commit_message>
<xml_diff>
--- a/3_Documentazione/Agenda Intelligenze documentazione.docx
+++ b/3_Documentazione/Agenda Intelligenze documentazione.docx
@@ -59,7 +59,7 @@
       <w:pPr>
         <w:pStyle w:val="Titolo1"/>
       </w:pPr>
-      <w:bookmarkStart w:id="0" w:name="_Toc124935596"/>
+      <w:bookmarkStart w:id="0" w:name="_Toc242441882"/>
       <w:r>
         <w:lastRenderedPageBreak/>
         <w:t>Indice</w:t>
@@ -76,9 +76,11 @@
         <w:rPr>
           <w:rFonts w:asciiTheme="minorHAnsi" w:eastAsiaTheme="minorEastAsia" w:hAnsiTheme="minorHAnsi" w:cstheme="minorBidi"/>
           <w:noProof/>
-          <w:sz w:val="22"/>
-          <w:szCs w:val="22"/>
+          <w:kern w:val="2"/>
+          <w:sz w:val="24"/>
+          <w:szCs w:val="24"/>
           <w:lang w:eastAsia="it-CH"/>
+          <w14:ligatures w14:val="standardContextual"/>
         </w:rPr>
       </w:pPr>
       <w:r>
@@ -100,9 +102,11 @@
         <w:rPr>
           <w:rFonts w:asciiTheme="minorHAnsi" w:eastAsiaTheme="minorEastAsia" w:hAnsiTheme="minorHAnsi" w:cstheme="minorBidi"/>
           <w:noProof/>
-          <w:sz w:val="22"/>
-          <w:szCs w:val="22"/>
+          <w:kern w:val="2"/>
+          <w:sz w:val="24"/>
+          <w:szCs w:val="24"/>
           <w:lang w:eastAsia="it-CH"/>
+          <w14:ligatures w14:val="standardContextual"/>
         </w:rPr>
         <w:tab/>
       </w:r>
@@ -128,7 +132,7 @@
         <w:rPr>
           <w:noProof/>
         </w:rPr>
-        <w:instrText xml:space="preserve"> PAGEREF _Toc124935596 \h </w:instrText>
+        <w:instrText xml:space="preserve"> PAGEREF _Toc242441882 \h </w:instrText>
       </w:r>
       <w:r>
         <w:rPr>
@@ -164,9 +168,11 @@
         <w:rPr>
           <w:rFonts w:asciiTheme="minorHAnsi" w:eastAsiaTheme="minorEastAsia" w:hAnsiTheme="minorHAnsi" w:cstheme="minorBidi"/>
           <w:noProof/>
-          <w:sz w:val="22"/>
-          <w:szCs w:val="22"/>
+          <w:kern w:val="2"/>
+          <w:sz w:val="24"/>
+          <w:szCs w:val="24"/>
           <w:lang w:eastAsia="it-CH"/>
+          <w14:ligatures w14:val="standardContextual"/>
         </w:rPr>
       </w:pPr>
       <w:r>
@@ -179,9 +185,11 @@
         <w:rPr>
           <w:rFonts w:asciiTheme="minorHAnsi" w:eastAsiaTheme="minorEastAsia" w:hAnsiTheme="minorHAnsi" w:cstheme="minorBidi"/>
           <w:noProof/>
-          <w:sz w:val="22"/>
-          <w:szCs w:val="22"/>
+          <w:kern w:val="2"/>
+          <w:sz w:val="24"/>
+          <w:szCs w:val="24"/>
           <w:lang w:eastAsia="it-CH"/>
+          <w14:ligatures w14:val="standardContextual"/>
         </w:rPr>
         <w:tab/>
       </w:r>
@@ -207,7 +215,7 @@
         <w:rPr>
           <w:noProof/>
         </w:rPr>
-        <w:instrText xml:space="preserve"> PAGEREF _Toc124935597 \h </w:instrText>
+        <w:instrText xml:space="preserve"> PAGEREF _Toc242441883 \h </w:instrText>
       </w:r>
       <w:r>
         <w:rPr>
@@ -243,9 +251,11 @@
         <w:rPr>
           <w:rFonts w:asciiTheme="minorHAnsi" w:eastAsiaTheme="minorEastAsia" w:hAnsiTheme="minorHAnsi" w:cstheme="minorBidi"/>
           <w:noProof/>
-          <w:sz w:val="22"/>
-          <w:szCs w:val="22"/>
+          <w:kern w:val="2"/>
+          <w:sz w:val="24"/>
+          <w:szCs w:val="24"/>
           <w:lang w:eastAsia="it-CH"/>
+          <w14:ligatures w14:val="standardContextual"/>
         </w:rPr>
       </w:pPr>
       <w:r>
@@ -258,9 +268,11 @@
         <w:rPr>
           <w:rFonts w:asciiTheme="minorHAnsi" w:eastAsiaTheme="minorEastAsia" w:hAnsiTheme="minorHAnsi" w:cstheme="minorBidi"/>
           <w:noProof/>
-          <w:sz w:val="22"/>
-          <w:szCs w:val="22"/>
+          <w:kern w:val="2"/>
+          <w:sz w:val="24"/>
+          <w:szCs w:val="24"/>
           <w:lang w:eastAsia="it-CH"/>
+          <w14:ligatures w14:val="standardContextual"/>
         </w:rPr>
         <w:tab/>
       </w:r>
@@ -286,7 +298,7 @@
         <w:rPr>
           <w:noProof/>
         </w:rPr>
-        <w:instrText xml:space="preserve"> PAGEREF _Toc124935598 \h </w:instrText>
+        <w:instrText xml:space="preserve"> PAGEREF _Toc242441884 \h </w:instrText>
       </w:r>
       <w:r>
         <w:rPr>
@@ -322,9 +334,11 @@
         <w:rPr>
           <w:rFonts w:asciiTheme="minorHAnsi" w:eastAsiaTheme="minorEastAsia" w:hAnsiTheme="minorHAnsi" w:cstheme="minorBidi"/>
           <w:noProof/>
-          <w:sz w:val="22"/>
-          <w:szCs w:val="22"/>
+          <w:kern w:val="2"/>
+          <w:sz w:val="24"/>
+          <w:szCs w:val="24"/>
           <w:lang w:eastAsia="it-CH"/>
+          <w14:ligatures w14:val="standardContextual"/>
         </w:rPr>
       </w:pPr>
       <w:r>
@@ -337,9 +351,11 @@
         <w:rPr>
           <w:rFonts w:asciiTheme="minorHAnsi" w:eastAsiaTheme="minorEastAsia" w:hAnsiTheme="minorHAnsi" w:cstheme="minorBidi"/>
           <w:noProof/>
-          <w:sz w:val="22"/>
-          <w:szCs w:val="22"/>
+          <w:kern w:val="2"/>
+          <w:sz w:val="24"/>
+          <w:szCs w:val="24"/>
           <w:lang w:eastAsia="it-CH"/>
+          <w14:ligatures w14:val="standardContextual"/>
         </w:rPr>
         <w:tab/>
       </w:r>
@@ -365,7 +381,7 @@
         <w:rPr>
           <w:noProof/>
         </w:rPr>
-        <w:instrText xml:space="preserve"> PAGEREF _Toc124935599 \h </w:instrText>
+        <w:instrText xml:space="preserve"> PAGEREF _Toc242441885 \h </w:instrText>
       </w:r>
       <w:r>
         <w:rPr>
@@ -401,9 +417,11 @@
         <w:rPr>
           <w:rFonts w:asciiTheme="minorHAnsi" w:eastAsiaTheme="minorEastAsia" w:hAnsiTheme="minorHAnsi" w:cstheme="minorBidi"/>
           <w:noProof/>
-          <w:sz w:val="22"/>
-          <w:szCs w:val="22"/>
+          <w:kern w:val="2"/>
+          <w:sz w:val="24"/>
+          <w:szCs w:val="24"/>
           <w:lang w:eastAsia="it-CH"/>
+          <w14:ligatures w14:val="standardContextual"/>
         </w:rPr>
       </w:pPr>
       <w:r>
@@ -416,9 +434,11 @@
         <w:rPr>
           <w:rFonts w:asciiTheme="minorHAnsi" w:eastAsiaTheme="minorEastAsia" w:hAnsiTheme="minorHAnsi" w:cstheme="minorBidi"/>
           <w:noProof/>
-          <w:sz w:val="22"/>
-          <w:szCs w:val="22"/>
+          <w:kern w:val="2"/>
+          <w:sz w:val="24"/>
+          <w:szCs w:val="24"/>
           <w:lang w:eastAsia="it-CH"/>
+          <w14:ligatures w14:val="standardContextual"/>
         </w:rPr>
         <w:tab/>
       </w:r>
@@ -444,7 +464,7 @@
         <w:rPr>
           <w:noProof/>
         </w:rPr>
-        <w:instrText xml:space="preserve"> PAGEREF _Toc124935600 \h </w:instrText>
+        <w:instrText xml:space="preserve"> PAGEREF _Toc242441886 \h </w:instrText>
       </w:r>
       <w:r>
         <w:rPr>
@@ -461,7 +481,7 @@
         <w:rPr>
           <w:noProof/>
         </w:rPr>
-        <w:t>3</w:t>
+        <w:t>4</w:t>
       </w:r>
       <w:r>
         <w:rPr>
@@ -480,9 +500,11 @@
         <w:rPr>
           <w:rFonts w:asciiTheme="minorHAnsi" w:eastAsiaTheme="minorEastAsia" w:hAnsiTheme="minorHAnsi" w:cstheme="minorBidi"/>
           <w:noProof/>
-          <w:sz w:val="22"/>
-          <w:szCs w:val="22"/>
+          <w:kern w:val="2"/>
+          <w:sz w:val="24"/>
+          <w:szCs w:val="24"/>
           <w:lang w:eastAsia="it-CH"/>
+          <w14:ligatures w14:val="standardContextual"/>
         </w:rPr>
       </w:pPr>
       <w:r>
@@ -495,9 +517,11 @@
         <w:rPr>
           <w:rFonts w:asciiTheme="minorHAnsi" w:eastAsiaTheme="minorEastAsia" w:hAnsiTheme="minorHAnsi" w:cstheme="minorBidi"/>
           <w:noProof/>
-          <w:sz w:val="22"/>
-          <w:szCs w:val="22"/>
+          <w:kern w:val="2"/>
+          <w:sz w:val="24"/>
+          <w:szCs w:val="24"/>
           <w:lang w:eastAsia="it-CH"/>
+          <w14:ligatures w14:val="standardContextual"/>
         </w:rPr>
         <w:tab/>
       </w:r>
@@ -523,7 +547,7 @@
         <w:rPr>
           <w:noProof/>
         </w:rPr>
-        <w:instrText xml:space="preserve"> PAGEREF _Toc124935601 \h </w:instrText>
+        <w:instrText xml:space="preserve"> PAGEREF _Toc242441887 \h </w:instrText>
       </w:r>
       <w:r>
         <w:rPr>
@@ -540,7 +564,7 @@
         <w:rPr>
           <w:noProof/>
         </w:rPr>
-        <w:t>4</w:t>
+        <w:t>5</w:t>
       </w:r>
       <w:r>
         <w:rPr>
@@ -559,9 +583,11 @@
         <w:rPr>
           <w:rFonts w:asciiTheme="minorHAnsi" w:eastAsiaTheme="minorEastAsia" w:hAnsiTheme="minorHAnsi" w:cstheme="minorBidi"/>
           <w:noProof/>
-          <w:sz w:val="22"/>
-          <w:szCs w:val="22"/>
+          <w:kern w:val="2"/>
+          <w:sz w:val="24"/>
+          <w:szCs w:val="24"/>
           <w:lang w:eastAsia="it-CH"/>
+          <w14:ligatures w14:val="standardContextual"/>
         </w:rPr>
       </w:pPr>
       <w:r>
@@ -574,9 +600,11 @@
         <w:rPr>
           <w:rFonts w:asciiTheme="minorHAnsi" w:eastAsiaTheme="minorEastAsia" w:hAnsiTheme="minorHAnsi" w:cstheme="minorBidi"/>
           <w:noProof/>
-          <w:sz w:val="22"/>
-          <w:szCs w:val="22"/>
+          <w:kern w:val="2"/>
+          <w:sz w:val="24"/>
+          <w:szCs w:val="24"/>
           <w:lang w:eastAsia="it-CH"/>
+          <w14:ligatures w14:val="standardContextual"/>
         </w:rPr>
         <w:tab/>
       </w:r>
@@ -602,7 +630,7 @@
         <w:rPr>
           <w:noProof/>
         </w:rPr>
-        <w:instrText xml:space="preserve"> PAGEREF _Toc124935602 \h </w:instrText>
+        <w:instrText xml:space="preserve"> PAGEREF _Toc242441888 \h </w:instrText>
       </w:r>
       <w:r>
         <w:rPr>
@@ -619,7 +647,7 @@
         <w:rPr>
           <w:noProof/>
         </w:rPr>
-        <w:t>4</w:t>
+        <w:t>5</w:t>
       </w:r>
       <w:r>
         <w:rPr>
@@ -638,9 +666,11 @@
         <w:rPr>
           <w:rFonts w:asciiTheme="minorHAnsi" w:eastAsiaTheme="minorEastAsia" w:hAnsiTheme="minorHAnsi" w:cstheme="minorBidi"/>
           <w:noProof/>
-          <w:sz w:val="22"/>
-          <w:szCs w:val="22"/>
+          <w:kern w:val="2"/>
+          <w:sz w:val="24"/>
+          <w:szCs w:val="24"/>
           <w:lang w:eastAsia="it-CH"/>
+          <w14:ligatures w14:val="standardContextual"/>
         </w:rPr>
       </w:pPr>
       <w:r>
@@ -653,9 +683,11 @@
         <w:rPr>
           <w:rFonts w:asciiTheme="minorHAnsi" w:eastAsiaTheme="minorEastAsia" w:hAnsiTheme="minorHAnsi" w:cstheme="minorBidi"/>
           <w:noProof/>
-          <w:sz w:val="22"/>
-          <w:szCs w:val="22"/>
+          <w:kern w:val="2"/>
+          <w:sz w:val="24"/>
+          <w:szCs w:val="24"/>
           <w:lang w:eastAsia="it-CH"/>
+          <w14:ligatures w14:val="standardContextual"/>
         </w:rPr>
         <w:tab/>
       </w:r>
@@ -681,7 +713,7 @@
         <w:rPr>
           <w:noProof/>
         </w:rPr>
-        <w:instrText xml:space="preserve"> PAGEREF _Toc124935603 \h </w:instrText>
+        <w:instrText xml:space="preserve"> PAGEREF _Toc242441889 \h </w:instrText>
       </w:r>
       <w:r>
         <w:rPr>
@@ -698,7 +730,7 @@
         <w:rPr>
           <w:noProof/>
         </w:rPr>
-        <w:t>4</w:t>
+        <w:t>5</w:t>
       </w:r>
       <w:r>
         <w:rPr>
@@ -717,9 +749,11 @@
         <w:rPr>
           <w:rFonts w:asciiTheme="minorHAnsi" w:eastAsiaTheme="minorEastAsia" w:hAnsiTheme="minorHAnsi" w:cstheme="minorBidi"/>
           <w:noProof/>
-          <w:sz w:val="22"/>
-          <w:szCs w:val="22"/>
+          <w:kern w:val="2"/>
+          <w:sz w:val="24"/>
+          <w:szCs w:val="24"/>
           <w:lang w:eastAsia="it-CH"/>
+          <w14:ligatures w14:val="standardContextual"/>
         </w:rPr>
       </w:pPr>
       <w:r>
@@ -732,9 +766,11 @@
         <w:rPr>
           <w:rFonts w:asciiTheme="minorHAnsi" w:eastAsiaTheme="minorEastAsia" w:hAnsiTheme="minorHAnsi" w:cstheme="minorBidi"/>
           <w:noProof/>
-          <w:sz w:val="22"/>
-          <w:szCs w:val="22"/>
+          <w:kern w:val="2"/>
+          <w:sz w:val="24"/>
+          <w:szCs w:val="24"/>
           <w:lang w:eastAsia="it-CH"/>
+          <w14:ligatures w14:val="standardContextual"/>
         </w:rPr>
         <w:tab/>
       </w:r>
@@ -760,7 +796,7 @@
         <w:rPr>
           <w:noProof/>
         </w:rPr>
-        <w:instrText xml:space="preserve"> PAGEREF _Toc124935604 \h </w:instrText>
+        <w:instrText xml:space="preserve"> PAGEREF _Toc242441890 \h </w:instrText>
       </w:r>
       <w:r>
         <w:rPr>
@@ -777,7 +813,7 @@
         <w:rPr>
           <w:noProof/>
         </w:rPr>
-        <w:t>7</w:t>
+        <w:t>9</w:t>
       </w:r>
       <w:r>
         <w:rPr>
@@ -796,9 +832,11 @@
         <w:rPr>
           <w:rFonts w:asciiTheme="minorHAnsi" w:eastAsiaTheme="minorEastAsia" w:hAnsiTheme="minorHAnsi" w:cstheme="minorBidi"/>
           <w:noProof/>
-          <w:sz w:val="22"/>
-          <w:szCs w:val="22"/>
+          <w:kern w:val="2"/>
+          <w:sz w:val="24"/>
+          <w:szCs w:val="24"/>
           <w:lang w:eastAsia="it-CH"/>
+          <w14:ligatures w14:val="standardContextual"/>
         </w:rPr>
       </w:pPr>
       <w:r>
@@ -811,9 +849,11 @@
         <w:rPr>
           <w:rFonts w:asciiTheme="minorHAnsi" w:eastAsiaTheme="minorEastAsia" w:hAnsiTheme="minorHAnsi" w:cstheme="minorBidi"/>
           <w:noProof/>
-          <w:sz w:val="22"/>
-          <w:szCs w:val="22"/>
+          <w:kern w:val="2"/>
+          <w:sz w:val="24"/>
+          <w:szCs w:val="24"/>
           <w:lang w:eastAsia="it-CH"/>
+          <w14:ligatures w14:val="standardContextual"/>
         </w:rPr>
         <w:tab/>
       </w:r>
@@ -839,7 +879,7 @@
         <w:rPr>
           <w:noProof/>
         </w:rPr>
-        <w:instrText xml:space="preserve"> PAGEREF _Toc124935605 \h </w:instrText>
+        <w:instrText xml:space="preserve"> PAGEREF _Toc242441891 \h </w:instrText>
       </w:r>
       <w:r>
         <w:rPr>
@@ -856,7 +896,7 @@
         <w:rPr>
           <w:noProof/>
         </w:rPr>
-        <w:t>7</w:t>
+        <w:t>10</w:t>
       </w:r>
       <w:r>
         <w:rPr>
@@ -875,9 +915,11 @@
         <w:rPr>
           <w:rFonts w:asciiTheme="minorHAnsi" w:eastAsiaTheme="minorEastAsia" w:hAnsiTheme="minorHAnsi" w:cstheme="minorBidi"/>
           <w:noProof/>
-          <w:sz w:val="22"/>
-          <w:szCs w:val="22"/>
+          <w:kern w:val="2"/>
+          <w:sz w:val="24"/>
+          <w:szCs w:val="24"/>
           <w:lang w:eastAsia="it-CH"/>
+          <w14:ligatures w14:val="standardContextual"/>
         </w:rPr>
       </w:pPr>
       <w:r>
@@ -890,9 +932,11 @@
         <w:rPr>
           <w:rFonts w:asciiTheme="minorHAnsi" w:eastAsiaTheme="minorEastAsia" w:hAnsiTheme="minorHAnsi" w:cstheme="minorBidi"/>
           <w:noProof/>
-          <w:sz w:val="22"/>
-          <w:szCs w:val="22"/>
+          <w:kern w:val="2"/>
+          <w:sz w:val="24"/>
+          <w:szCs w:val="24"/>
           <w:lang w:eastAsia="it-CH"/>
+          <w14:ligatures w14:val="standardContextual"/>
         </w:rPr>
         <w:tab/>
       </w:r>
@@ -918,7 +962,7 @@
         <w:rPr>
           <w:noProof/>
         </w:rPr>
-        <w:instrText xml:space="preserve"> PAGEREF _Toc124935606 \h </w:instrText>
+        <w:instrText xml:space="preserve"> PAGEREF _Toc242441892 \h </w:instrText>
       </w:r>
       <w:r>
         <w:rPr>
@@ -935,7 +979,7 @@
         <w:rPr>
           <w:noProof/>
         </w:rPr>
-        <w:t>9</w:t>
+        <w:t>11</w:t>
       </w:r>
       <w:r>
         <w:rPr>
@@ -954,9 +998,11 @@
         <w:rPr>
           <w:rFonts w:asciiTheme="minorHAnsi" w:eastAsiaTheme="minorEastAsia" w:hAnsiTheme="minorHAnsi" w:cstheme="minorBidi"/>
           <w:noProof/>
-          <w:sz w:val="22"/>
-          <w:szCs w:val="22"/>
+          <w:kern w:val="2"/>
+          <w:sz w:val="24"/>
+          <w:szCs w:val="24"/>
           <w:lang w:eastAsia="it-CH"/>
+          <w14:ligatures w14:val="standardContextual"/>
         </w:rPr>
       </w:pPr>
       <w:r>
@@ -969,9 +1015,11 @@
         <w:rPr>
           <w:rFonts w:asciiTheme="minorHAnsi" w:eastAsiaTheme="minorEastAsia" w:hAnsiTheme="minorHAnsi" w:cstheme="minorBidi"/>
           <w:noProof/>
-          <w:sz w:val="22"/>
-          <w:szCs w:val="22"/>
+          <w:kern w:val="2"/>
+          <w:sz w:val="24"/>
+          <w:szCs w:val="24"/>
           <w:lang w:eastAsia="it-CH"/>
+          <w14:ligatures w14:val="standardContextual"/>
         </w:rPr>
         <w:tab/>
       </w:r>
@@ -997,7 +1045,7 @@
         <w:rPr>
           <w:noProof/>
         </w:rPr>
-        <w:instrText xml:space="preserve"> PAGEREF _Toc124935607 \h </w:instrText>
+        <w:instrText xml:space="preserve"> PAGEREF _Toc242441893 \h </w:instrText>
       </w:r>
       <w:r>
         <w:rPr>
@@ -1014,7 +1062,7 @@
         <w:rPr>
           <w:noProof/>
         </w:rPr>
-        <w:t>9</w:t>
+        <w:t>11</w:t>
       </w:r>
       <w:r>
         <w:rPr>
@@ -1033,9 +1081,11 @@
         <w:rPr>
           <w:rFonts w:asciiTheme="minorHAnsi" w:eastAsiaTheme="minorEastAsia" w:hAnsiTheme="minorHAnsi" w:cstheme="minorBidi"/>
           <w:noProof/>
-          <w:sz w:val="22"/>
-          <w:szCs w:val="22"/>
+          <w:kern w:val="2"/>
+          <w:sz w:val="24"/>
+          <w:szCs w:val="24"/>
           <w:lang w:eastAsia="it-CH"/>
+          <w14:ligatures w14:val="standardContextual"/>
         </w:rPr>
       </w:pPr>
       <w:r>
@@ -1048,9 +1098,11 @@
         <w:rPr>
           <w:rFonts w:asciiTheme="minorHAnsi" w:eastAsiaTheme="minorEastAsia" w:hAnsiTheme="minorHAnsi" w:cstheme="minorBidi"/>
           <w:noProof/>
-          <w:sz w:val="22"/>
-          <w:szCs w:val="22"/>
+          <w:kern w:val="2"/>
+          <w:sz w:val="24"/>
+          <w:szCs w:val="24"/>
           <w:lang w:eastAsia="it-CH"/>
+          <w14:ligatures w14:val="standardContextual"/>
         </w:rPr>
         <w:tab/>
       </w:r>
@@ -1076,7 +1128,7 @@
         <w:rPr>
           <w:noProof/>
         </w:rPr>
-        <w:instrText xml:space="preserve"> PAGEREF _Toc124935608 \h </w:instrText>
+        <w:instrText xml:space="preserve"> PAGEREF _Toc242441894 \h </w:instrText>
       </w:r>
       <w:r>
         <w:rPr>
@@ -1093,7 +1145,7 @@
         <w:rPr>
           <w:noProof/>
         </w:rPr>
-        <w:t>9</w:t>
+        <w:t>11</w:t>
       </w:r>
       <w:r>
         <w:rPr>
@@ -1112,9 +1164,11 @@
         <w:rPr>
           <w:rFonts w:asciiTheme="minorHAnsi" w:eastAsiaTheme="minorEastAsia" w:hAnsiTheme="minorHAnsi" w:cstheme="minorBidi"/>
           <w:noProof/>
-          <w:sz w:val="22"/>
-          <w:szCs w:val="22"/>
+          <w:kern w:val="2"/>
+          <w:sz w:val="24"/>
+          <w:szCs w:val="24"/>
           <w:lang w:eastAsia="it-CH"/>
+          <w14:ligatures w14:val="standardContextual"/>
         </w:rPr>
       </w:pPr>
       <w:r>
@@ -1127,9 +1181,11 @@
         <w:rPr>
           <w:rFonts w:asciiTheme="minorHAnsi" w:eastAsiaTheme="minorEastAsia" w:hAnsiTheme="minorHAnsi" w:cstheme="minorBidi"/>
           <w:noProof/>
-          <w:sz w:val="22"/>
-          <w:szCs w:val="22"/>
+          <w:kern w:val="2"/>
+          <w:sz w:val="24"/>
+          <w:szCs w:val="24"/>
           <w:lang w:eastAsia="it-CH"/>
+          <w14:ligatures w14:val="standardContextual"/>
         </w:rPr>
         <w:tab/>
       </w:r>
@@ -1155,7 +1211,7 @@
         <w:rPr>
           <w:noProof/>
         </w:rPr>
-        <w:instrText xml:space="preserve"> PAGEREF _Toc124935609 \h </w:instrText>
+        <w:instrText xml:space="preserve"> PAGEREF _Toc242441895 \h </w:instrText>
       </w:r>
       <w:r>
         <w:rPr>
@@ -1172,7 +1228,7 @@
         <w:rPr>
           <w:noProof/>
         </w:rPr>
-        <w:t>9</w:t>
+        <w:t>11</w:t>
       </w:r>
       <w:r>
         <w:rPr>
@@ -1191,9 +1247,11 @@
         <w:rPr>
           <w:rFonts w:asciiTheme="minorHAnsi" w:eastAsiaTheme="minorEastAsia" w:hAnsiTheme="minorHAnsi" w:cstheme="minorBidi"/>
           <w:noProof/>
-          <w:sz w:val="22"/>
-          <w:szCs w:val="22"/>
+          <w:kern w:val="2"/>
+          <w:sz w:val="24"/>
+          <w:szCs w:val="24"/>
           <w:lang w:eastAsia="it-CH"/>
+          <w14:ligatures w14:val="standardContextual"/>
         </w:rPr>
       </w:pPr>
       <w:r>
@@ -1206,9 +1264,11 @@
         <w:rPr>
           <w:rFonts w:asciiTheme="minorHAnsi" w:eastAsiaTheme="minorEastAsia" w:hAnsiTheme="minorHAnsi" w:cstheme="minorBidi"/>
           <w:noProof/>
-          <w:sz w:val="22"/>
-          <w:szCs w:val="22"/>
+          <w:kern w:val="2"/>
+          <w:sz w:val="24"/>
+          <w:szCs w:val="24"/>
           <w:lang w:eastAsia="it-CH"/>
+          <w14:ligatures w14:val="standardContextual"/>
         </w:rPr>
         <w:tab/>
       </w:r>
@@ -1234,7 +1294,7 @@
         <w:rPr>
           <w:noProof/>
         </w:rPr>
-        <w:instrText xml:space="preserve"> PAGEREF _Toc124935610 \h </w:instrText>
+        <w:instrText xml:space="preserve"> PAGEREF _Toc242441896 \h </w:instrText>
       </w:r>
       <w:r>
         <w:rPr>
@@ -1251,7 +1311,7 @@
         <w:rPr>
           <w:noProof/>
         </w:rPr>
-        <w:t>9</w:t>
+        <w:t>11</w:t>
       </w:r>
       <w:r>
         <w:rPr>
@@ -1270,9 +1330,11 @@
         <w:rPr>
           <w:rFonts w:asciiTheme="minorHAnsi" w:eastAsiaTheme="minorEastAsia" w:hAnsiTheme="minorHAnsi" w:cstheme="minorBidi"/>
           <w:noProof/>
-          <w:sz w:val="22"/>
-          <w:szCs w:val="22"/>
+          <w:kern w:val="2"/>
+          <w:sz w:val="24"/>
+          <w:szCs w:val="24"/>
           <w:lang w:eastAsia="it-CH"/>
+          <w14:ligatures w14:val="standardContextual"/>
         </w:rPr>
       </w:pPr>
       <w:r>
@@ -1285,9 +1347,11 @@
         <w:rPr>
           <w:rFonts w:asciiTheme="minorHAnsi" w:eastAsiaTheme="minorEastAsia" w:hAnsiTheme="minorHAnsi" w:cstheme="minorBidi"/>
           <w:noProof/>
-          <w:sz w:val="22"/>
-          <w:szCs w:val="22"/>
+          <w:kern w:val="2"/>
+          <w:sz w:val="24"/>
+          <w:szCs w:val="24"/>
           <w:lang w:eastAsia="it-CH"/>
+          <w14:ligatures w14:val="standardContextual"/>
         </w:rPr>
         <w:tab/>
       </w:r>
@@ -1313,7 +1377,7 @@
         <w:rPr>
           <w:noProof/>
         </w:rPr>
-        <w:instrText xml:space="preserve"> PAGEREF _Toc124935611 \h </w:instrText>
+        <w:instrText xml:space="preserve"> PAGEREF _Toc242441897 \h </w:instrText>
       </w:r>
       <w:r>
         <w:rPr>
@@ -1330,7 +1394,7 @@
         <w:rPr>
           <w:noProof/>
         </w:rPr>
-        <w:t>9</w:t>
+        <w:t>11</w:t>
       </w:r>
       <w:r>
         <w:rPr>
@@ -1349,9 +1413,11 @@
         <w:rPr>
           <w:rFonts w:asciiTheme="minorHAnsi" w:eastAsiaTheme="minorEastAsia" w:hAnsiTheme="minorHAnsi" w:cstheme="minorBidi"/>
           <w:noProof/>
-          <w:sz w:val="22"/>
-          <w:szCs w:val="22"/>
+          <w:kern w:val="2"/>
+          <w:sz w:val="24"/>
+          <w:szCs w:val="24"/>
           <w:lang w:eastAsia="it-CH"/>
+          <w14:ligatures w14:val="standardContextual"/>
         </w:rPr>
       </w:pPr>
       <w:r>
@@ -1364,9 +1430,11 @@
         <w:rPr>
           <w:rFonts w:asciiTheme="minorHAnsi" w:eastAsiaTheme="minorEastAsia" w:hAnsiTheme="minorHAnsi" w:cstheme="minorBidi"/>
           <w:noProof/>
-          <w:sz w:val="22"/>
-          <w:szCs w:val="22"/>
+          <w:kern w:val="2"/>
+          <w:sz w:val="24"/>
+          <w:szCs w:val="24"/>
           <w:lang w:eastAsia="it-CH"/>
+          <w14:ligatures w14:val="standardContextual"/>
         </w:rPr>
         <w:tab/>
       </w:r>
@@ -1392,7 +1460,7 @@
         <w:rPr>
           <w:noProof/>
         </w:rPr>
-        <w:instrText xml:space="preserve"> PAGEREF _Toc124935612 \h </w:instrText>
+        <w:instrText xml:space="preserve"> PAGEREF _Toc242441898 \h </w:instrText>
       </w:r>
       <w:r>
         <w:rPr>
@@ -1409,7 +1477,7 @@
         <w:rPr>
           <w:noProof/>
         </w:rPr>
-        <w:t>12</w:t>
+        <w:t>14</w:t>
       </w:r>
       <w:r>
         <w:rPr>
@@ -1428,9 +1496,11 @@
         <w:rPr>
           <w:rFonts w:asciiTheme="minorHAnsi" w:eastAsiaTheme="minorEastAsia" w:hAnsiTheme="minorHAnsi" w:cstheme="minorBidi"/>
           <w:noProof/>
-          <w:sz w:val="22"/>
-          <w:szCs w:val="22"/>
+          <w:kern w:val="2"/>
+          <w:sz w:val="24"/>
+          <w:szCs w:val="24"/>
           <w:lang w:eastAsia="it-CH"/>
+          <w14:ligatures w14:val="standardContextual"/>
         </w:rPr>
       </w:pPr>
       <w:r>
@@ -1443,9 +1513,11 @@
         <w:rPr>
           <w:rFonts w:asciiTheme="minorHAnsi" w:eastAsiaTheme="minorEastAsia" w:hAnsiTheme="minorHAnsi" w:cstheme="minorBidi"/>
           <w:noProof/>
-          <w:sz w:val="22"/>
-          <w:szCs w:val="22"/>
+          <w:kern w:val="2"/>
+          <w:sz w:val="24"/>
+          <w:szCs w:val="24"/>
           <w:lang w:eastAsia="it-CH"/>
+          <w14:ligatures w14:val="standardContextual"/>
         </w:rPr>
         <w:tab/>
       </w:r>
@@ -1471,7 +1543,7 @@
         <w:rPr>
           <w:noProof/>
         </w:rPr>
-        <w:instrText xml:space="preserve"> PAGEREF _Toc124935613 \h </w:instrText>
+        <w:instrText xml:space="preserve"> PAGEREF _Toc242441899 \h </w:instrText>
       </w:r>
       <w:r>
         <w:rPr>
@@ -1488,7 +1560,7 @@
         <w:rPr>
           <w:noProof/>
         </w:rPr>
-        <w:t>12</w:t>
+        <w:t>14</w:t>
       </w:r>
       <w:r>
         <w:rPr>
@@ -1507,9 +1579,11 @@
         <w:rPr>
           <w:rFonts w:asciiTheme="minorHAnsi" w:eastAsiaTheme="minorEastAsia" w:hAnsiTheme="minorHAnsi" w:cstheme="minorBidi"/>
           <w:noProof/>
-          <w:sz w:val="22"/>
-          <w:szCs w:val="22"/>
+          <w:kern w:val="2"/>
+          <w:sz w:val="24"/>
+          <w:szCs w:val="24"/>
           <w:lang w:eastAsia="it-CH"/>
+          <w14:ligatures w14:val="standardContextual"/>
         </w:rPr>
       </w:pPr>
       <w:r>
@@ -1522,9 +1596,11 @@
         <w:rPr>
           <w:rFonts w:asciiTheme="minorHAnsi" w:eastAsiaTheme="minorEastAsia" w:hAnsiTheme="minorHAnsi" w:cstheme="minorBidi"/>
           <w:noProof/>
-          <w:sz w:val="22"/>
-          <w:szCs w:val="22"/>
+          <w:kern w:val="2"/>
+          <w:sz w:val="24"/>
+          <w:szCs w:val="24"/>
           <w:lang w:eastAsia="it-CH"/>
+          <w14:ligatures w14:val="standardContextual"/>
         </w:rPr>
         <w:tab/>
       </w:r>
@@ -1550,7 +1626,7 @@
         <w:rPr>
           <w:noProof/>
         </w:rPr>
-        <w:instrText xml:space="preserve"> PAGEREF _Toc124935614 \h </w:instrText>
+        <w:instrText xml:space="preserve"> PAGEREF _Toc242441900 \h </w:instrText>
       </w:r>
       <w:r>
         <w:rPr>
@@ -1567,7 +1643,7 @@
         <w:rPr>
           <w:noProof/>
         </w:rPr>
-        <w:t>13</w:t>
+        <w:t>15</w:t>
       </w:r>
       <w:r>
         <w:rPr>
@@ -1586,9 +1662,11 @@
         <w:rPr>
           <w:rFonts w:asciiTheme="minorHAnsi" w:eastAsiaTheme="minorEastAsia" w:hAnsiTheme="minorHAnsi" w:cstheme="minorBidi"/>
           <w:noProof/>
-          <w:sz w:val="22"/>
-          <w:szCs w:val="22"/>
+          <w:kern w:val="2"/>
+          <w:sz w:val="24"/>
+          <w:szCs w:val="24"/>
           <w:lang w:eastAsia="it-CH"/>
+          <w14:ligatures w14:val="standardContextual"/>
         </w:rPr>
       </w:pPr>
       <w:r>
@@ -1601,9 +1679,11 @@
         <w:rPr>
           <w:rFonts w:asciiTheme="minorHAnsi" w:eastAsiaTheme="minorEastAsia" w:hAnsiTheme="minorHAnsi" w:cstheme="minorBidi"/>
           <w:noProof/>
-          <w:sz w:val="22"/>
-          <w:szCs w:val="22"/>
+          <w:kern w:val="2"/>
+          <w:sz w:val="24"/>
+          <w:szCs w:val="24"/>
           <w:lang w:eastAsia="it-CH"/>
+          <w14:ligatures w14:val="standardContextual"/>
         </w:rPr>
         <w:tab/>
       </w:r>
@@ -1629,7 +1709,7 @@
         <w:rPr>
           <w:noProof/>
         </w:rPr>
-        <w:instrText xml:space="preserve"> PAGEREF _Toc124935615 \h </w:instrText>
+        <w:instrText xml:space="preserve"> PAGEREF _Toc242441901 \h </w:instrText>
       </w:r>
       <w:r>
         <w:rPr>
@@ -1646,7 +1726,7 @@
         <w:rPr>
           <w:noProof/>
         </w:rPr>
-        <w:t>13</w:t>
+        <w:t>15</w:t>
       </w:r>
       <w:r>
         <w:rPr>
@@ -1665,9 +1745,11 @@
         <w:rPr>
           <w:rFonts w:asciiTheme="minorHAnsi" w:eastAsiaTheme="minorEastAsia" w:hAnsiTheme="minorHAnsi" w:cstheme="minorBidi"/>
           <w:noProof/>
-          <w:sz w:val="22"/>
-          <w:szCs w:val="22"/>
+          <w:kern w:val="2"/>
+          <w:sz w:val="24"/>
+          <w:szCs w:val="24"/>
           <w:lang w:eastAsia="it-CH"/>
+          <w14:ligatures w14:val="standardContextual"/>
         </w:rPr>
       </w:pPr>
       <w:r>
@@ -1680,9 +1762,11 @@
         <w:rPr>
           <w:rFonts w:asciiTheme="minorHAnsi" w:eastAsiaTheme="minorEastAsia" w:hAnsiTheme="minorHAnsi" w:cstheme="minorBidi"/>
           <w:noProof/>
-          <w:sz w:val="22"/>
-          <w:szCs w:val="22"/>
+          <w:kern w:val="2"/>
+          <w:sz w:val="24"/>
+          <w:szCs w:val="24"/>
           <w:lang w:eastAsia="it-CH"/>
+          <w14:ligatures w14:val="standardContextual"/>
         </w:rPr>
         <w:tab/>
       </w:r>
@@ -1708,7 +1792,7 @@
         <w:rPr>
           <w:noProof/>
         </w:rPr>
-        <w:instrText xml:space="preserve"> PAGEREF _Toc124935616 \h </w:instrText>
+        <w:instrText xml:space="preserve"> PAGEREF _Toc242441902 \h </w:instrText>
       </w:r>
       <w:r>
         <w:rPr>
@@ -1725,7 +1809,7 @@
         <w:rPr>
           <w:noProof/>
         </w:rPr>
-        <w:t>13</w:t>
+        <w:t>15</w:t>
       </w:r>
       <w:r>
         <w:rPr>
@@ -1744,9 +1828,11 @@
         <w:rPr>
           <w:rFonts w:asciiTheme="minorHAnsi" w:eastAsiaTheme="minorEastAsia" w:hAnsiTheme="minorHAnsi" w:cstheme="minorBidi"/>
           <w:noProof/>
-          <w:sz w:val="22"/>
-          <w:szCs w:val="22"/>
+          <w:kern w:val="2"/>
+          <w:sz w:val="24"/>
+          <w:szCs w:val="24"/>
           <w:lang w:eastAsia="it-CH"/>
+          <w14:ligatures w14:val="standardContextual"/>
         </w:rPr>
       </w:pPr>
       <w:r>
@@ -1759,9 +1845,11 @@
         <w:rPr>
           <w:rFonts w:asciiTheme="minorHAnsi" w:eastAsiaTheme="minorEastAsia" w:hAnsiTheme="minorHAnsi" w:cstheme="minorBidi"/>
           <w:noProof/>
-          <w:sz w:val="22"/>
-          <w:szCs w:val="22"/>
+          <w:kern w:val="2"/>
+          <w:sz w:val="24"/>
+          <w:szCs w:val="24"/>
           <w:lang w:eastAsia="it-CH"/>
+          <w14:ligatures w14:val="standardContextual"/>
         </w:rPr>
         <w:tab/>
       </w:r>
@@ -1787,7 +1875,7 @@
         <w:rPr>
           <w:noProof/>
         </w:rPr>
-        <w:instrText xml:space="preserve"> PAGEREF _Toc124935617 \h </w:instrText>
+        <w:instrText xml:space="preserve"> PAGEREF _Toc242441903 \h </w:instrText>
       </w:r>
       <w:r>
         <w:rPr>
@@ -1804,7 +1892,7 @@
         <w:rPr>
           <w:noProof/>
         </w:rPr>
-        <w:t>15</w:t>
+        <w:t>23</w:t>
       </w:r>
       <w:r>
         <w:rPr>
@@ -1823,9 +1911,11 @@
         <w:rPr>
           <w:rFonts w:asciiTheme="minorHAnsi" w:eastAsiaTheme="minorEastAsia" w:hAnsiTheme="minorHAnsi" w:cstheme="minorBidi"/>
           <w:noProof/>
-          <w:sz w:val="22"/>
-          <w:szCs w:val="22"/>
+          <w:kern w:val="2"/>
+          <w:sz w:val="24"/>
+          <w:szCs w:val="24"/>
           <w:lang w:eastAsia="it-CH"/>
+          <w14:ligatures w14:val="standardContextual"/>
         </w:rPr>
       </w:pPr>
       <w:r>
@@ -1838,9 +1928,11 @@
         <w:rPr>
           <w:rFonts w:asciiTheme="minorHAnsi" w:eastAsiaTheme="minorEastAsia" w:hAnsiTheme="minorHAnsi" w:cstheme="minorBidi"/>
           <w:noProof/>
-          <w:sz w:val="22"/>
-          <w:szCs w:val="22"/>
+          <w:kern w:val="2"/>
+          <w:sz w:val="24"/>
+          <w:szCs w:val="24"/>
           <w:lang w:eastAsia="it-CH"/>
+          <w14:ligatures w14:val="standardContextual"/>
         </w:rPr>
         <w:tab/>
       </w:r>
@@ -1866,7 +1958,7 @@
         <w:rPr>
           <w:noProof/>
         </w:rPr>
-        <w:instrText xml:space="preserve"> PAGEREF _Toc124935618 \h </w:instrText>
+        <w:instrText xml:space="preserve"> PAGEREF _Toc242441904 \h </w:instrText>
       </w:r>
       <w:r>
         <w:rPr>
@@ -1883,7 +1975,7 @@
         <w:rPr>
           <w:noProof/>
         </w:rPr>
-        <w:t>15</w:t>
+        <w:t>23</w:t>
       </w:r>
       <w:r>
         <w:rPr>
@@ -1902,9 +1994,11 @@
         <w:rPr>
           <w:rFonts w:asciiTheme="minorHAnsi" w:eastAsiaTheme="minorEastAsia" w:hAnsiTheme="minorHAnsi" w:cstheme="minorBidi"/>
           <w:noProof/>
-          <w:sz w:val="22"/>
-          <w:szCs w:val="22"/>
+          <w:kern w:val="2"/>
+          <w:sz w:val="24"/>
+          <w:szCs w:val="24"/>
           <w:lang w:eastAsia="it-CH"/>
+          <w14:ligatures w14:val="standardContextual"/>
         </w:rPr>
       </w:pPr>
       <w:r>
@@ -1917,9 +2011,11 @@
         <w:rPr>
           <w:rFonts w:asciiTheme="minorHAnsi" w:eastAsiaTheme="minorEastAsia" w:hAnsiTheme="minorHAnsi" w:cstheme="minorBidi"/>
           <w:noProof/>
-          <w:sz w:val="22"/>
-          <w:szCs w:val="22"/>
+          <w:kern w:val="2"/>
+          <w:sz w:val="24"/>
+          <w:szCs w:val="24"/>
           <w:lang w:eastAsia="it-CH"/>
+          <w14:ligatures w14:val="standardContextual"/>
         </w:rPr>
         <w:tab/>
       </w:r>
@@ -1945,7 +2041,7 @@
         <w:rPr>
           <w:noProof/>
         </w:rPr>
-        <w:instrText xml:space="preserve"> PAGEREF _Toc124935619 \h </w:instrText>
+        <w:instrText xml:space="preserve"> PAGEREF _Toc242441905 \h </w:instrText>
       </w:r>
       <w:r>
         <w:rPr>
@@ -1962,7 +2058,7 @@
         <w:rPr>
           <w:noProof/>
         </w:rPr>
-        <w:t>15</w:t>
+        <w:t>23</w:t>
       </w:r>
       <w:r>
         <w:rPr>
@@ -1981,9 +2077,11 @@
         <w:rPr>
           <w:rFonts w:asciiTheme="minorHAnsi" w:eastAsiaTheme="minorEastAsia" w:hAnsiTheme="minorHAnsi" w:cstheme="minorBidi"/>
           <w:noProof/>
-          <w:sz w:val="22"/>
-          <w:szCs w:val="22"/>
+          <w:kern w:val="2"/>
+          <w:sz w:val="24"/>
+          <w:szCs w:val="24"/>
           <w:lang w:eastAsia="it-CH"/>
+          <w14:ligatures w14:val="standardContextual"/>
         </w:rPr>
       </w:pPr>
       <w:r>
@@ -1996,9 +2094,11 @@
         <w:rPr>
           <w:rFonts w:asciiTheme="minorHAnsi" w:eastAsiaTheme="minorEastAsia" w:hAnsiTheme="minorHAnsi" w:cstheme="minorBidi"/>
           <w:noProof/>
-          <w:sz w:val="22"/>
-          <w:szCs w:val="22"/>
+          <w:kern w:val="2"/>
+          <w:sz w:val="24"/>
+          <w:szCs w:val="24"/>
           <w:lang w:eastAsia="it-CH"/>
+          <w14:ligatures w14:val="standardContextual"/>
         </w:rPr>
         <w:tab/>
       </w:r>
@@ -2024,7 +2124,7 @@
         <w:rPr>
           <w:noProof/>
         </w:rPr>
-        <w:instrText xml:space="preserve"> PAGEREF _Toc124935620 \h </w:instrText>
+        <w:instrText xml:space="preserve"> PAGEREF _Toc242441906 \h </w:instrText>
       </w:r>
       <w:r>
         <w:rPr>
@@ -2041,7 +2141,7 @@
         <w:rPr>
           <w:noProof/>
         </w:rPr>
-        <w:t>17</w:t>
+        <w:t>25</w:t>
       </w:r>
       <w:r>
         <w:rPr>
@@ -2060,9 +2160,11 @@
         <w:rPr>
           <w:rFonts w:asciiTheme="minorHAnsi" w:eastAsiaTheme="minorEastAsia" w:hAnsiTheme="minorHAnsi" w:cstheme="minorBidi"/>
           <w:noProof/>
-          <w:sz w:val="22"/>
-          <w:szCs w:val="22"/>
+          <w:kern w:val="2"/>
+          <w:sz w:val="24"/>
+          <w:szCs w:val="24"/>
           <w:lang w:eastAsia="it-CH"/>
+          <w14:ligatures w14:val="standardContextual"/>
         </w:rPr>
       </w:pPr>
       <w:r>
@@ -2075,9 +2177,11 @@
         <w:rPr>
           <w:rFonts w:asciiTheme="minorHAnsi" w:eastAsiaTheme="minorEastAsia" w:hAnsiTheme="minorHAnsi" w:cstheme="minorBidi"/>
           <w:noProof/>
-          <w:sz w:val="22"/>
-          <w:szCs w:val="22"/>
+          <w:kern w:val="2"/>
+          <w:sz w:val="24"/>
+          <w:szCs w:val="24"/>
           <w:lang w:eastAsia="it-CH"/>
+          <w14:ligatures w14:val="standardContextual"/>
         </w:rPr>
         <w:tab/>
       </w:r>
@@ -2103,7 +2207,7 @@
         <w:rPr>
           <w:noProof/>
         </w:rPr>
-        <w:instrText xml:space="preserve"> PAGEREF _Toc124935621 \h </w:instrText>
+        <w:instrText xml:space="preserve"> PAGEREF _Toc242441907 \h </w:instrText>
       </w:r>
       <w:r>
         <w:rPr>
@@ -2120,7 +2224,7 @@
         <w:rPr>
           <w:noProof/>
         </w:rPr>
-        <w:t>17</w:t>
+        <w:t>25</w:t>
       </w:r>
       <w:r>
         <w:rPr>
@@ -2139,9 +2243,11 @@
         <w:rPr>
           <w:rFonts w:asciiTheme="minorHAnsi" w:eastAsiaTheme="minorEastAsia" w:hAnsiTheme="minorHAnsi" w:cstheme="minorBidi"/>
           <w:noProof/>
-          <w:sz w:val="22"/>
-          <w:szCs w:val="22"/>
+          <w:kern w:val="2"/>
+          <w:sz w:val="24"/>
+          <w:szCs w:val="24"/>
           <w:lang w:eastAsia="it-CH"/>
+          <w14:ligatures w14:val="standardContextual"/>
         </w:rPr>
       </w:pPr>
       <w:r>
@@ -2154,9 +2260,11 @@
         <w:rPr>
           <w:rFonts w:asciiTheme="minorHAnsi" w:eastAsiaTheme="minorEastAsia" w:hAnsiTheme="minorHAnsi" w:cstheme="minorBidi"/>
           <w:noProof/>
-          <w:sz w:val="22"/>
-          <w:szCs w:val="22"/>
+          <w:kern w:val="2"/>
+          <w:sz w:val="24"/>
+          <w:szCs w:val="24"/>
           <w:lang w:eastAsia="it-CH"/>
+          <w14:ligatures w14:val="standardContextual"/>
         </w:rPr>
         <w:tab/>
       </w:r>
@@ -2182,7 +2290,7 @@
         <w:rPr>
           <w:noProof/>
         </w:rPr>
-        <w:instrText xml:space="preserve"> PAGEREF _Toc124935622 \h </w:instrText>
+        <w:instrText xml:space="preserve"> PAGEREF _Toc242441908 \h </w:instrText>
       </w:r>
       <w:r>
         <w:rPr>
@@ -2199,7 +2307,7 @@
         <w:rPr>
           <w:noProof/>
         </w:rPr>
-        <w:t>17</w:t>
+        <w:t>25</w:t>
       </w:r>
       <w:r>
         <w:rPr>
@@ -2218,9 +2326,11 @@
         <w:rPr>
           <w:rFonts w:asciiTheme="minorHAnsi" w:eastAsiaTheme="minorEastAsia" w:hAnsiTheme="minorHAnsi" w:cstheme="minorBidi"/>
           <w:noProof/>
-          <w:sz w:val="22"/>
-          <w:szCs w:val="22"/>
+          <w:kern w:val="2"/>
+          <w:sz w:val="24"/>
+          <w:szCs w:val="24"/>
           <w:lang w:eastAsia="it-CH"/>
+          <w14:ligatures w14:val="standardContextual"/>
         </w:rPr>
       </w:pPr>
       <w:r>
@@ -2233,9 +2343,11 @@
         <w:rPr>
           <w:rFonts w:asciiTheme="minorHAnsi" w:eastAsiaTheme="minorEastAsia" w:hAnsiTheme="minorHAnsi" w:cstheme="minorBidi"/>
           <w:noProof/>
-          <w:sz w:val="22"/>
-          <w:szCs w:val="22"/>
+          <w:kern w:val="2"/>
+          <w:sz w:val="24"/>
+          <w:szCs w:val="24"/>
           <w:lang w:eastAsia="it-CH"/>
+          <w14:ligatures w14:val="standardContextual"/>
         </w:rPr>
         <w:tab/>
       </w:r>
@@ -2261,7 +2373,7 @@
         <w:rPr>
           <w:noProof/>
         </w:rPr>
-        <w:instrText xml:space="preserve"> PAGEREF _Toc124935623 \h </w:instrText>
+        <w:instrText xml:space="preserve"> PAGEREF _Toc242441909 \h </w:instrText>
       </w:r>
       <w:r>
         <w:rPr>
@@ -2278,7 +2390,7 @@
         <w:rPr>
           <w:noProof/>
         </w:rPr>
-        <w:t>18</w:t>
+        <w:t>26</w:t>
       </w:r>
       <w:r>
         <w:rPr>
@@ -2297,9 +2409,11 @@
         <w:rPr>
           <w:rFonts w:asciiTheme="minorHAnsi" w:eastAsiaTheme="minorEastAsia" w:hAnsiTheme="minorHAnsi" w:cstheme="minorBidi"/>
           <w:noProof/>
-          <w:sz w:val="22"/>
-          <w:szCs w:val="22"/>
+          <w:kern w:val="2"/>
+          <w:sz w:val="24"/>
+          <w:szCs w:val="24"/>
           <w:lang w:eastAsia="it-CH"/>
+          <w14:ligatures w14:val="standardContextual"/>
         </w:rPr>
       </w:pPr>
       <w:r>
@@ -2312,9 +2426,11 @@
         <w:rPr>
           <w:rFonts w:asciiTheme="minorHAnsi" w:eastAsiaTheme="minorEastAsia" w:hAnsiTheme="minorHAnsi" w:cstheme="minorBidi"/>
           <w:noProof/>
-          <w:sz w:val="22"/>
-          <w:szCs w:val="22"/>
+          <w:kern w:val="2"/>
+          <w:sz w:val="24"/>
+          <w:szCs w:val="24"/>
           <w:lang w:eastAsia="it-CH"/>
+          <w14:ligatures w14:val="standardContextual"/>
         </w:rPr>
         <w:tab/>
       </w:r>
@@ -2340,7 +2456,7 @@
         <w:rPr>
           <w:noProof/>
         </w:rPr>
-        <w:instrText xml:space="preserve"> PAGEREF _Toc124935624 \h </w:instrText>
+        <w:instrText xml:space="preserve"> PAGEREF _Toc242441910 \h </w:instrText>
       </w:r>
       <w:r>
         <w:rPr>
@@ -2357,7 +2473,7 @@
         <w:rPr>
           <w:noProof/>
         </w:rPr>
-        <w:t>18</w:t>
+        <w:t>26</w:t>
       </w:r>
       <w:r>
         <w:rPr>
@@ -2376,9 +2492,11 @@
         <w:rPr>
           <w:rFonts w:asciiTheme="minorHAnsi" w:eastAsiaTheme="minorEastAsia" w:hAnsiTheme="minorHAnsi" w:cstheme="minorBidi"/>
           <w:noProof/>
-          <w:sz w:val="22"/>
-          <w:szCs w:val="22"/>
+          <w:kern w:val="2"/>
+          <w:sz w:val="24"/>
+          <w:szCs w:val="24"/>
           <w:lang w:eastAsia="it-CH"/>
+          <w14:ligatures w14:val="standardContextual"/>
         </w:rPr>
       </w:pPr>
       <w:r>
@@ -2391,9 +2509,11 @@
         <w:rPr>
           <w:rFonts w:asciiTheme="minorHAnsi" w:eastAsiaTheme="minorEastAsia" w:hAnsiTheme="minorHAnsi" w:cstheme="minorBidi"/>
           <w:noProof/>
-          <w:sz w:val="22"/>
-          <w:szCs w:val="22"/>
+          <w:kern w:val="2"/>
+          <w:sz w:val="24"/>
+          <w:szCs w:val="24"/>
           <w:lang w:eastAsia="it-CH"/>
+          <w14:ligatures w14:val="standardContextual"/>
         </w:rPr>
         <w:tab/>
       </w:r>
@@ -2419,7 +2539,7 @@
         <w:rPr>
           <w:noProof/>
         </w:rPr>
-        <w:instrText xml:space="preserve"> PAGEREF _Toc124935625 \h </w:instrText>
+        <w:instrText xml:space="preserve"> PAGEREF _Toc242441911 \h </w:instrText>
       </w:r>
       <w:r>
         <w:rPr>
@@ -2436,7 +2556,7 @@
         <w:rPr>
           <w:noProof/>
         </w:rPr>
-        <w:t>18</w:t>
+        <w:t>26</w:t>
       </w:r>
       <w:r>
         <w:rPr>
@@ -2455,9 +2575,11 @@
         <w:rPr>
           <w:rFonts w:asciiTheme="minorHAnsi" w:eastAsiaTheme="minorEastAsia" w:hAnsiTheme="minorHAnsi" w:cstheme="minorBidi"/>
           <w:noProof/>
-          <w:sz w:val="22"/>
-          <w:szCs w:val="22"/>
+          <w:kern w:val="2"/>
+          <w:sz w:val="24"/>
+          <w:szCs w:val="24"/>
           <w:lang w:eastAsia="it-CH"/>
+          <w14:ligatures w14:val="standardContextual"/>
         </w:rPr>
       </w:pPr>
       <w:r>
@@ -2470,9 +2592,11 @@
         <w:rPr>
           <w:rFonts w:asciiTheme="minorHAnsi" w:eastAsiaTheme="minorEastAsia" w:hAnsiTheme="minorHAnsi" w:cstheme="minorBidi"/>
           <w:noProof/>
-          <w:sz w:val="22"/>
-          <w:szCs w:val="22"/>
+          <w:kern w:val="2"/>
+          <w:sz w:val="24"/>
+          <w:szCs w:val="24"/>
           <w:lang w:eastAsia="it-CH"/>
+          <w14:ligatures w14:val="standardContextual"/>
         </w:rPr>
         <w:tab/>
       </w:r>
@@ -2498,7 +2622,7 @@
         <w:rPr>
           <w:noProof/>
         </w:rPr>
-        <w:instrText xml:space="preserve"> PAGEREF _Toc124935626 \h </w:instrText>
+        <w:instrText xml:space="preserve"> PAGEREF _Toc242441912 \h </w:instrText>
       </w:r>
       <w:r>
         <w:rPr>
@@ -2515,7 +2639,7 @@
         <w:rPr>
           <w:noProof/>
         </w:rPr>
-        <w:t>18</w:t>
+        <w:t>26</w:t>
       </w:r>
       <w:r>
         <w:rPr>
@@ -2534,9 +2658,11 @@
         <w:rPr>
           <w:rFonts w:asciiTheme="minorHAnsi" w:eastAsiaTheme="minorEastAsia" w:hAnsiTheme="minorHAnsi" w:cstheme="minorBidi"/>
           <w:noProof/>
-          <w:sz w:val="22"/>
-          <w:szCs w:val="22"/>
+          <w:kern w:val="2"/>
+          <w:sz w:val="24"/>
+          <w:szCs w:val="24"/>
           <w:lang w:eastAsia="it-CH"/>
+          <w14:ligatures w14:val="standardContextual"/>
         </w:rPr>
       </w:pPr>
       <w:r>
@@ -2549,9 +2675,11 @@
         <w:rPr>
           <w:rFonts w:asciiTheme="minorHAnsi" w:eastAsiaTheme="minorEastAsia" w:hAnsiTheme="minorHAnsi" w:cstheme="minorBidi"/>
           <w:noProof/>
-          <w:sz w:val="22"/>
-          <w:szCs w:val="22"/>
+          <w:kern w:val="2"/>
+          <w:sz w:val="24"/>
+          <w:szCs w:val="24"/>
           <w:lang w:eastAsia="it-CH"/>
+          <w14:ligatures w14:val="standardContextual"/>
         </w:rPr>
         <w:tab/>
       </w:r>
@@ -2577,7 +2705,7 @@
         <w:rPr>
           <w:noProof/>
         </w:rPr>
-        <w:instrText xml:space="preserve"> PAGEREF _Toc124935627 \h </w:instrText>
+        <w:instrText xml:space="preserve"> PAGEREF _Toc242441913 \h </w:instrText>
       </w:r>
       <w:r>
         <w:rPr>
@@ -2594,7 +2722,7 @@
         <w:rPr>
           <w:noProof/>
         </w:rPr>
-        <w:t>19</w:t>
+        <w:t>27</w:t>
       </w:r>
       <w:r>
         <w:rPr>
@@ -2613,9 +2741,11 @@
         <w:rPr>
           <w:rFonts w:asciiTheme="minorHAnsi" w:eastAsiaTheme="minorEastAsia" w:hAnsiTheme="minorHAnsi" w:cstheme="minorBidi"/>
           <w:noProof/>
-          <w:sz w:val="22"/>
-          <w:szCs w:val="22"/>
+          <w:kern w:val="2"/>
+          <w:sz w:val="24"/>
+          <w:szCs w:val="24"/>
           <w:lang w:eastAsia="it-CH"/>
+          <w14:ligatures w14:val="standardContextual"/>
         </w:rPr>
       </w:pPr>
       <w:r>
@@ -2628,9 +2758,11 @@
         <w:rPr>
           <w:rFonts w:asciiTheme="minorHAnsi" w:eastAsiaTheme="minorEastAsia" w:hAnsiTheme="minorHAnsi" w:cstheme="minorBidi"/>
           <w:noProof/>
-          <w:sz w:val="22"/>
-          <w:szCs w:val="22"/>
+          <w:kern w:val="2"/>
+          <w:sz w:val="24"/>
+          <w:szCs w:val="24"/>
           <w:lang w:eastAsia="it-CH"/>
+          <w14:ligatures w14:val="standardContextual"/>
         </w:rPr>
         <w:tab/>
       </w:r>
@@ -2656,7 +2788,7 @@
         <w:rPr>
           <w:noProof/>
         </w:rPr>
-        <w:instrText xml:space="preserve"> PAGEREF _Toc124935628 \h </w:instrText>
+        <w:instrText xml:space="preserve"> PAGEREF _Toc242441914 \h </w:instrText>
       </w:r>
       <w:r>
         <w:rPr>
@@ -2673,7 +2805,7 @@
         <w:rPr>
           <w:noProof/>
         </w:rPr>
-        <w:t>19</w:t>
+        <w:t>27</w:t>
       </w:r>
       <w:r>
         <w:rPr>
@@ -2692,9 +2824,11 @@
         <w:rPr>
           <w:rFonts w:asciiTheme="minorHAnsi" w:eastAsiaTheme="minorEastAsia" w:hAnsiTheme="minorHAnsi" w:cstheme="minorBidi"/>
           <w:noProof/>
-          <w:sz w:val="22"/>
-          <w:szCs w:val="22"/>
+          <w:kern w:val="2"/>
+          <w:sz w:val="24"/>
+          <w:szCs w:val="24"/>
           <w:lang w:eastAsia="it-CH"/>
+          <w14:ligatures w14:val="standardContextual"/>
         </w:rPr>
       </w:pPr>
       <w:r>
@@ -2707,9 +2841,11 @@
         <w:rPr>
           <w:rFonts w:asciiTheme="minorHAnsi" w:eastAsiaTheme="minorEastAsia" w:hAnsiTheme="minorHAnsi" w:cstheme="minorBidi"/>
           <w:noProof/>
-          <w:sz w:val="22"/>
-          <w:szCs w:val="22"/>
+          <w:kern w:val="2"/>
+          <w:sz w:val="24"/>
+          <w:szCs w:val="24"/>
           <w:lang w:eastAsia="it-CH"/>
+          <w14:ligatures w14:val="standardContextual"/>
         </w:rPr>
         <w:tab/>
       </w:r>
@@ -2735,7 +2871,7 @@
         <w:rPr>
           <w:noProof/>
         </w:rPr>
-        <w:instrText xml:space="preserve"> PAGEREF _Toc124935629 \h </w:instrText>
+        <w:instrText xml:space="preserve"> PAGEREF _Toc242441915 \h </w:instrText>
       </w:r>
       <w:r>
         <w:rPr>
@@ -2752,7 +2888,7 @@
         <w:rPr>
           <w:noProof/>
         </w:rPr>
-        <w:t>19</w:t>
+        <w:t>27</w:t>
       </w:r>
       <w:r>
         <w:rPr>
@@ -2773,7 +2909,7 @@
       <w:r>
         <w:br w:type="page"/>
       </w:r>
-      <w:bookmarkStart w:id="1" w:name="_Toc124935597"/>
+      <w:bookmarkStart w:id="1" w:name="_Toc242441883"/>
       <w:r>
         <w:lastRenderedPageBreak/>
         <w:t>Introduzione</w:t>
@@ -2787,7 +2923,7 @@
           <w:lang w:val="it-CH"/>
         </w:rPr>
       </w:pPr>
-      <w:bookmarkStart w:id="2" w:name="_Toc124935598"/>
+      <w:bookmarkStart w:id="2" w:name="_Toc242441884"/>
       <w:r>
         <w:rPr>
           <w:lang w:val="it-CH"/>
@@ -2936,7 +3072,7 @@
           <w:lang w:val="it-CH"/>
         </w:rPr>
       </w:pPr>
-      <w:bookmarkStart w:id="3" w:name="_Toc124935599"/>
+      <w:bookmarkStart w:id="3" w:name="_Toc242441885"/>
       <w:r>
         <w:rPr>
           <w:lang w:val="it-CH"/>
@@ -3863,7 +3999,7 @@
           <w:lang w:val="it-CH"/>
         </w:rPr>
       </w:pPr>
-      <w:bookmarkStart w:id="4" w:name="_Toc124935600"/>
+      <w:bookmarkStart w:id="4" w:name="_Toc242441886"/>
       <w:r>
         <w:rPr>
           <w:lang w:val="it-CH"/>
@@ -4095,7 +4231,7 @@
       <w:r>
         <w:br w:type="page"/>
       </w:r>
-      <w:bookmarkStart w:id="5" w:name="_Toc124935601"/>
+      <w:bookmarkStart w:id="5" w:name="_Toc242441887"/>
       <w:r>
         <w:lastRenderedPageBreak/>
         <w:t>Analisi</w:t>
@@ -4109,7 +4245,7 @@
           <w:lang w:val="it-CH"/>
         </w:rPr>
       </w:pPr>
-      <w:bookmarkStart w:id="6" w:name="_Toc124935602"/>
+      <w:bookmarkStart w:id="6" w:name="_Toc242441888"/>
       <w:r>
         <w:rPr>
           <w:lang w:val="it-CH"/>
@@ -4192,7 +4328,7 @@
           <w:lang w:val="it-CH"/>
         </w:rPr>
       </w:pPr>
-      <w:bookmarkStart w:id="7" w:name="_Toc124935603"/>
+      <w:bookmarkStart w:id="7" w:name="_Toc242441889"/>
       <w:r>
         <w:rPr>
           <w:lang w:val="it-CH"/>
@@ -7336,7 +7472,7 @@
         </w:rPr>
         <w:br w:type="page"/>
       </w:r>
-      <w:bookmarkStart w:id="8" w:name="_Toc124935604"/>
+      <w:bookmarkStart w:id="8" w:name="_Toc242441890"/>
       <w:r>
         <w:rPr>
           <w:lang w:val="it-CH"/>
@@ -7426,7 +7562,7 @@
           <w:lang w:val="it-CH"/>
         </w:rPr>
       </w:pPr>
-      <w:bookmarkStart w:id="9" w:name="_Toc124935605"/>
+      <w:bookmarkStart w:id="9" w:name="_Toc242441891"/>
       <w:r>
         <w:rPr>
           <w:lang w:val="it-CH"/>
@@ -7448,6 +7584,9 @@
         <w:jc w:val="center"/>
       </w:pPr>
       <w:r>
+        <w:rPr>
+          <w:noProof/>
+        </w:rPr>
         <w:drawing>
           <wp:inline distT="0" distB="0" distL="0" distR="0" wp14:anchorId="3690A7DB" wp14:editId="617F3F3E">
             <wp:extent cx="9777730" cy="4142105"/>
@@ -7515,7 +7654,7 @@
           <w:lang w:val="it-CH"/>
         </w:rPr>
       </w:pPr>
-      <w:bookmarkStart w:id="10" w:name="_Toc124935606"/>
+      <w:bookmarkStart w:id="10" w:name="_Toc242441892"/>
       <w:r>
         <w:rPr>
           <w:lang w:val="it-CH"/>
@@ -7544,7 +7683,7 @@
         </w:rPr>
       </w:pPr>
       <w:bookmarkStart w:id="11" w:name="_Toc413411419"/>
-      <w:bookmarkStart w:id="12" w:name="_Toc124935607"/>
+      <w:bookmarkStart w:id="12" w:name="_Toc242441893"/>
       <w:r>
         <w:rPr>
           <w:lang w:val="it-CH"/>
@@ -7569,22 +7708,60 @@
       </w:r>
     </w:p>
     <w:p>
-      <w:r>
+      <w:pPr>
+        <w:rPr>
+          <w:lang w:val="de-CH"/>
+        </w:rPr>
+      </w:pPr>
+      <w:r>
+        <w:rPr>
+          <w:lang w:val="de-CH"/>
+        </w:rPr>
         <w:t>Dart SDK (</w:t>
       </w:r>
+      <w:proofErr w:type="spellStart"/>
       <w:proofErr w:type="gramStart"/>
       <w:r>
-        <w:t>versione )</w:t>
+        <w:rPr>
+          <w:lang w:val="de-CH"/>
+        </w:rPr>
+        <w:t>versione</w:t>
+      </w:r>
+      <w:proofErr w:type="spellEnd"/>
+      <w:r>
+        <w:rPr>
+          <w:lang w:val="de-CH"/>
+        </w:rPr>
+        <w:t xml:space="preserve"> )</w:t>
       </w:r>
       <w:proofErr w:type="gramEnd"/>
     </w:p>
     <w:p>
-      <w:r>
+      <w:pPr>
+        <w:rPr>
+          <w:lang w:val="de-CH"/>
+        </w:rPr>
+      </w:pPr>
+      <w:r>
+        <w:rPr>
+          <w:lang w:val="de-CH"/>
+        </w:rPr>
         <w:t>Flutter SDK (</w:t>
       </w:r>
+      <w:proofErr w:type="spellStart"/>
       <w:proofErr w:type="gramStart"/>
       <w:r>
-        <w:t>versione )</w:t>
+        <w:rPr>
+          <w:lang w:val="de-CH"/>
+        </w:rPr>
+        <w:t>versione</w:t>
+      </w:r>
+      <w:proofErr w:type="spellEnd"/>
+      <w:r>
+        <w:rPr>
+          <w:lang w:val="de-CH"/>
+        </w:rPr>
+        <w:t xml:space="preserve"> )</w:t>
       </w:r>
       <w:proofErr w:type="gramEnd"/>
     </w:p>
@@ -7650,7 +7827,7 @@
         </w:rPr>
       </w:pPr>
       <w:bookmarkStart w:id="13" w:name="_Toc413411420"/>
-      <w:bookmarkStart w:id="14" w:name="_Toc124935608"/>
+      <w:bookmarkStart w:id="14" w:name="_Toc242441894"/>
       <w:r>
         <w:rPr>
           <w:lang w:val="it-CH"/>
@@ -7715,7 +7892,7 @@
         <w:pStyle w:val="Titolo1"/>
       </w:pPr>
       <w:bookmarkStart w:id="15" w:name="_Toc429059808"/>
-      <w:bookmarkStart w:id="16" w:name="_Toc124935609"/>
+      <w:bookmarkStart w:id="16" w:name="_Toc242441895"/>
       <w:r>
         <w:t>Progettazione</w:t>
       </w:r>
@@ -7736,7 +7913,7 @@
         </w:rPr>
       </w:pPr>
       <w:bookmarkStart w:id="17" w:name="_Toc429059809"/>
-      <w:bookmarkStart w:id="18" w:name="_Toc124935610"/>
+      <w:bookmarkStart w:id="18" w:name="_Toc242441896"/>
       <w:r>
         <w:rPr>
           <w:lang w:val="it-CH"/>
@@ -7748,6 +7925,32 @@
     </w:p>
     <w:p>
       <w:r>
+        <w:t>Salvataggio password:</w:t>
+      </w:r>
+    </w:p>
+    <w:p>
+      <w:proofErr w:type="spellStart"/>
+      <w:r>
+        <w:t>Bycript</w:t>
+      </w:r>
+      <w:proofErr w:type="spellEnd"/>
+      <w:r>
+        <w:t xml:space="preserve"> con </w:t>
+      </w:r>
+      <w:proofErr w:type="spellStart"/>
+      <w:r>
+        <w:t>hash</w:t>
+      </w:r>
+      <w:proofErr w:type="spellEnd"/>
+      <w:r>
+        <w:t>, la password viene</w:t>
+      </w:r>
+      <w:r>
+        <w:t xml:space="preserve"> salvata nella tabella utente, ma prima viene criptata e distrutta la sua versione non criptata. I parametri per criptarla sono la password, id utente e nome utente (in INT) </w:t>
+      </w:r>
+    </w:p>
+    <w:p>
+      <w:r>
         <w:t>Descrive:</w:t>
       </w:r>
     </w:p>
@@ -7772,6 +7975,10 @@
       <w:r>
         <w:t>Gli oggetti/moduli/componenti che lo compongono.</w:t>
       </w:r>
+      <w:r>
+        <w:br/>
+        <w:t>mobil devices per test/destinatari</w:t>
+      </w:r>
     </w:p>
     <w:p>
       <w:pPr>
@@ -7817,11 +8024,12 @@
         </w:rPr>
       </w:pPr>
       <w:bookmarkStart w:id="19" w:name="_Toc429059810"/>
-      <w:bookmarkStart w:id="20" w:name="_Toc124935611"/>
+      <w:bookmarkStart w:id="20" w:name="_Toc242441897"/>
       <w:r>
         <w:rPr>
           <w:lang w:val="it-CH"/>
         </w:rPr>
+        <w:lastRenderedPageBreak/>
         <w:t>Design dei dati e database</w:t>
       </w:r>
       <w:bookmarkEnd w:id="19"/>
@@ -7834,7 +8042,6 @@
     </w:p>
     <w:p>
       <w:r>
-        <w:lastRenderedPageBreak/>
         <w:t>Schema E-R, schema logico e descrizione.</w:t>
       </w:r>
     </w:p>
@@ -8072,7 +8279,7 @@
         </w:rPr>
       </w:pPr>
       <w:bookmarkStart w:id="23" w:name="_Toc429059811"/>
-      <w:bookmarkStart w:id="24" w:name="_Toc124935612"/>
+      <w:bookmarkStart w:id="24" w:name="_Toc242441898"/>
       <w:r>
         <w:rPr>
           <w:lang w:val="it-CH"/>
@@ -8104,7 +8311,7 @@
         </w:rPr>
       </w:pPr>
       <w:bookmarkStart w:id="25" w:name="_Toc429059812"/>
-      <w:bookmarkStart w:id="26" w:name="_Toc124935613"/>
+      <w:bookmarkStart w:id="26" w:name="_Toc242441899"/>
       <w:r>
         <w:rPr>
           <w:lang w:val="it-CH"/>
@@ -8196,7 +8403,7 @@
         <w:pStyle w:val="Titolo1"/>
       </w:pPr>
       <w:bookmarkStart w:id="27" w:name="_Toc461179222"/>
-      <w:bookmarkStart w:id="28" w:name="_Toc124935614"/>
+      <w:bookmarkStart w:id="28" w:name="_Toc242441900"/>
       <w:r>
         <w:lastRenderedPageBreak/>
         <w:t>Implementazione</w:t>
@@ -8263,7 +8470,7 @@
         <w:pStyle w:val="Titolo1"/>
       </w:pPr>
       <w:bookmarkStart w:id="29" w:name="_Toc461179223"/>
-      <w:bookmarkStart w:id="30" w:name="_Toc124935615"/>
+      <w:bookmarkStart w:id="30" w:name="_Toc242441901"/>
       <w:r>
         <w:t>Test</w:t>
       </w:r>
@@ -8278,7 +8485,7 @@
         </w:rPr>
       </w:pPr>
       <w:bookmarkStart w:id="31" w:name="_Toc461179224"/>
-      <w:bookmarkStart w:id="32" w:name="_Toc124935616"/>
+      <w:bookmarkStart w:id="32" w:name="_Toc242441902"/>
       <w:r>
         <w:rPr>
           <w:lang w:val="it-CH"/>
@@ -10293,15 +10500,7 @@
                 <w:szCs w:val="24"/>
                 <w:lang w:val="it-CH"/>
               </w:rPr>
-              <w:t>, a</w:t>
-            </w:r>
-            <w:r>
-              <w:rPr>
-                <w:sz w:val="24"/>
-                <w:szCs w:val="24"/>
-                <w:lang w:val="it-CH"/>
-              </w:rPr>
-              <w:t>pp installata e accesso effettuato</w:t>
+              <w:t>, app installata e accesso effettuato</w:t>
             </w:r>
             <w:r>
               <w:rPr>
@@ -13042,15 +13241,7 @@
                 <w:szCs w:val="24"/>
                 <w:lang w:val="it-CH"/>
               </w:rPr>
-              <w:t>Salvare</w:t>
-            </w:r>
-            <w:r>
-              <w:rPr>
-                <w:sz w:val="24"/>
-                <w:szCs w:val="24"/>
-                <w:lang w:val="it-CH"/>
-              </w:rPr>
-              <w:t xml:space="preserve"> </w:t>
+              <w:t xml:space="preserve">Salvare </w:t>
             </w:r>
             <w:r>
               <w:rPr>
@@ -17042,7 +17233,7 @@
           <w:lang w:val="it-CH"/>
         </w:rPr>
       </w:pPr>
-      <w:bookmarkStart w:id="34" w:name="_Toc124935617"/>
+      <w:bookmarkStart w:id="34" w:name="_Toc242441903"/>
       <w:r>
         <w:rPr>
           <w:lang w:val="it-CH"/>
@@ -17285,7 +17476,7 @@
         </w:rPr>
       </w:pPr>
       <w:bookmarkStart w:id="35" w:name="_Toc461179226"/>
-      <w:bookmarkStart w:id="36" w:name="_Toc124935618"/>
+      <w:bookmarkStart w:id="36" w:name="_Toc242441904"/>
       <w:r>
         <w:rPr>
           <w:lang w:val="it-CH"/>
@@ -17305,7 +17496,7 @@
         <w:pStyle w:val="Titolo1"/>
       </w:pPr>
       <w:bookmarkStart w:id="37" w:name="_Toc461179227"/>
-      <w:bookmarkStart w:id="38" w:name="_Toc124935619"/>
+      <w:bookmarkStart w:id="38" w:name="_Toc242441905"/>
       <w:r>
         <w:t>Consuntivo</w:t>
       </w:r>
@@ -17599,7 +17790,7 @@
         <w:pStyle w:val="Titolo1"/>
       </w:pPr>
       <w:bookmarkStart w:id="40" w:name="_Toc461179228"/>
-      <w:bookmarkStart w:id="41" w:name="_Toc124935620"/>
+      <w:bookmarkStart w:id="41" w:name="_Toc242441906"/>
       <w:r>
         <w:lastRenderedPageBreak/>
         <w:t>Conclusioni</w:t>
@@ -17623,7 +17814,7 @@
         </w:rPr>
       </w:pPr>
       <w:bookmarkStart w:id="42" w:name="_Toc461179229"/>
-      <w:bookmarkStart w:id="43" w:name="_Toc124935621"/>
+      <w:bookmarkStart w:id="43" w:name="_Toc242441907"/>
       <w:r>
         <w:rPr>
           <w:lang w:val="it-CH"/>
@@ -17646,7 +17837,7 @@
         </w:rPr>
       </w:pPr>
       <w:bookmarkStart w:id="44" w:name="_Toc461179230"/>
-      <w:bookmarkStart w:id="45" w:name="_Toc124935622"/>
+      <w:bookmarkStart w:id="45" w:name="_Toc242441908"/>
       <w:r>
         <w:rPr>
           <w:lang w:val="it-CH"/>
@@ -17680,7 +17871,7 @@
       <w:pPr>
         <w:pStyle w:val="Titolo1"/>
       </w:pPr>
-      <w:bookmarkStart w:id="47" w:name="_Toc124935623"/>
+      <w:bookmarkStart w:id="47" w:name="_Toc242441909"/>
       <w:r>
         <w:lastRenderedPageBreak/>
         <w:t>Bibliografia</w:t>
@@ -17696,7 +17887,7 @@
         </w:rPr>
       </w:pPr>
       <w:bookmarkStart w:id="48" w:name="_Toc461179232"/>
-      <w:bookmarkStart w:id="49" w:name="_Toc124935624"/>
+      <w:bookmarkStart w:id="49" w:name="_Toc242441910"/>
       <w:r>
         <w:rPr>
           <w:lang w:val="it-CH"/>
@@ -17772,7 +17963,7 @@
         </w:rPr>
       </w:pPr>
       <w:bookmarkStart w:id="50" w:name="_Toc461179233"/>
-      <w:bookmarkStart w:id="51" w:name="_Toc124935625"/>
+      <w:bookmarkStart w:id="51" w:name="_Toc242441911"/>
       <w:r>
         <w:rPr>
           <w:lang w:val="it-CH"/>
@@ -17861,7 +18052,7 @@
         </w:rPr>
       </w:pPr>
       <w:bookmarkStart w:id="52" w:name="_Toc461179234"/>
-      <w:bookmarkStart w:id="53" w:name="_Toc124935626"/>
+      <w:bookmarkStart w:id="53" w:name="_Toc242441912"/>
       <w:r>
         <w:rPr>
           <w:lang w:val="it-CH"/>
@@ -17991,7 +18182,7 @@
       <w:pPr>
         <w:pStyle w:val="Titolo1"/>
       </w:pPr>
-      <w:bookmarkStart w:id="55" w:name="_Toc124935627"/>
+      <w:bookmarkStart w:id="55" w:name="_Toc242441913"/>
       <w:r>
         <w:lastRenderedPageBreak/>
         <w:t>Glossario</w:t>
@@ -18177,7 +18368,7 @@
       <w:pPr>
         <w:pStyle w:val="Titolo1"/>
       </w:pPr>
-      <w:bookmarkStart w:id="56" w:name="_Toc124935628"/>
+      <w:bookmarkStart w:id="56" w:name="_Toc242441914"/>
       <w:r>
         <w:t>Indice delle figure</w:t>
       </w:r>
@@ -18561,7 +18752,7 @@
       <w:pPr>
         <w:pStyle w:val="Titolo1"/>
       </w:pPr>
-      <w:bookmarkStart w:id="57" w:name="_Toc124935629"/>
+      <w:bookmarkStart w:id="57" w:name="_Toc242441915"/>
       <w:r>
         <w:t>Allegati</w:t>
       </w:r>
@@ -19310,7 +19501,7 @@
         <w:noProof/>
         <w:sz w:val="20"/>
       </w:rPr>
-      <w:t>18.09.2026</w:t>
+      <w:t>25.09.2026</w:t>
     </w:r>
     <w:r>
       <w:rPr>
@@ -19538,7 +19729,7 @@
         <w:noProof/>
         <w:sz w:val="20"/>
       </w:rPr>
-      <w:t>18.09.2026</w:t>
+      <w:t>25.09.2026</w:t>
     </w:r>
     <w:r>
       <w:rPr>
@@ -28513,6 +28704,7 @@
   <w:style w:type="character" w:default="1" w:styleId="Carpredefinitoparagrafo">
     <w:name w:val="Default Paragraph Font"/>
     <w:uiPriority w:val="1"/>
+    <w:semiHidden/>
     <w:unhideWhenUsed/>
   </w:style>
   <w:style w:type="table" w:default="1" w:styleId="Tabellanormale">

</xml_diff>

<commit_message>
Prima pagina con logica parziale
</commit_message>
<xml_diff>
--- a/3_Documentazione/Agenda Intelligenze documentazione.docx
+++ b/3_Documentazione/Agenda Intelligenze documentazione.docx
@@ -8054,6 +8054,7 @@
     <w:p>
       <w:r>
         <w:rPr>
+          <w:noProof/>
           <w:lang w:val="de-CH"/>
         </w:rPr>
         <w:drawing>
@@ -8173,6 +8174,9 @@
     </w:p>
     <w:p>
       <w:r>
+        <w:rPr>
+          <w:noProof/>
+        </w:rPr>
         <w:drawing>
           <wp:inline distT="0" distB="0" distL="0" distR="0" wp14:anchorId="4F339EA6" wp14:editId="28099A7D">
             <wp:extent cx="6343187" cy="5200650"/>
@@ -8226,6 +8230,9 @@
         <w:t>Modifica di un evento</w:t>
       </w:r>
       <w:r>
+        <w:rPr>
+          <w:noProof/>
+        </w:rPr>
         <w:drawing>
           <wp:inline distT="0" distB="0" distL="0" distR="0" wp14:anchorId="5CEB5B60" wp14:editId="07FE0A8B">
             <wp:extent cx="6195966" cy="4876800"/>
@@ -8280,6 +8287,7 @@
         <w:rPr>
           <w:b/>
           <w:bCs/>
+          <w:noProof/>
         </w:rPr>
         <w:drawing>
           <wp:inline distT="0" distB="0" distL="0" distR="0" wp14:anchorId="5B99F697" wp14:editId="69947B7C">
@@ -8349,23 +8357,7 @@
             <w:b/>
             <w:bCs/>
           </w:rPr>
-          <w:t>..\7_Allegati\flusso</w:t>
-        </w:r>
-        <w:r>
-          <w:rPr>
-            <w:rStyle w:val="Collegamentoipertestuale"/>
-            <w:b/>
-            <w:bCs/>
-          </w:rPr>
-          <w:t>.</w:t>
-        </w:r>
-        <w:r>
-          <w:rPr>
-            <w:rStyle w:val="Collegamentoipertestuale"/>
-            <w:b/>
-            <w:bCs/>
-          </w:rPr>
-          <w:t>md</w:t>
+          <w:t>..\7_Allegati\flusso.md</w:t>
         </w:r>
       </w:hyperlink>
       <w:r>
@@ -8534,6 +8526,7 @@
       </w:pPr>
       <w:r>
         <w:rPr>
+          <w:noProof/>
           <w:lang w:val="it-IT"/>
         </w:rPr>
         <w:drawing>
@@ -8729,6 +8722,8 @@
     <w:p>
       <w:pPr>
         <w:rPr>
+          <w:b/>
+          <w:bCs/>
           <w:lang w:val="it-IT"/>
         </w:rPr>
       </w:pPr>
@@ -8737,6 +8732,13 @@
           <w:lang w:val="it-IT"/>
         </w:rPr>
         <w:br/>
+      </w:r>
+      <w:r>
+        <w:rPr>
+          <w:b/>
+          <w:bCs/>
+          <w:lang w:val="it-IT"/>
+        </w:rPr>
         <w:t>Nel mentre che viene generato il progetto, modificare l’installazione/scaricare VS community 2022</w:t>
       </w:r>
     </w:p>
@@ -8815,10 +8817,7 @@
         <w:pStyle w:val="Titolo2"/>
       </w:pPr>
       <w:r>
-        <w:t>Orga</w:t>
-      </w:r>
-      <w:r>
-        <w:t>nizzazione cartella</w:t>
+        <w:t>Organizzazione cartella</w:t>
       </w:r>
     </w:p>
     <w:p>
@@ -20003,7 +20002,7 @@
         <w:noProof/>
         <w:sz w:val="20"/>
       </w:rPr>
-      <w:t>09.10.2026</w:t>
+      <w:t>16.10.2026</w:t>
     </w:r>
     <w:r>
       <w:rPr>
@@ -20231,7 +20230,7 @@
         <w:noProof/>
         <w:sz w:val="20"/>
       </w:rPr>
-      <w:t>09.10.2026</w:t>
+      <w:t>16.10.2026</w:t>
     </w:r>
     <w:r>
       <w:rPr>

</xml_diff>